<commit_message>
Apply same witness corrections to Bangasan: strike shoot/strike quotes
Per operator, Bangasan's review matches Guevara's: neither witness made
out 'at barilin kita' or 'Patitirahin kita', so both statements now
carry only what each heard (curses, manloloko/magnanakaw, alis kayo
dito, anong gusto mo). The shoot threat rests on Allan's own testimony,
corroborated on all surrounding facts by both witnesses - flag #0
rewritten accordingly. Regenerated both witness docx and the packet;
'barilin kita' now appears only in Allan's supplemental (verified).

Co-Authored-By: Claude Fable 5 <noreply@anthropic.com>
Claude-Session: https://claude.ai/code/session_01UpQ6SZaDgERSUKhzTqk5Nt
</commit_message>
<xml_diff>
--- a/case_work/Paracale-001/WITNESS_AFFIDAVIT_BANGASAN_2026-09-05.docx
+++ b/case_work/Paracale-001/WITNESS_AFFIDAVIT_BANGASAN_2026-09-05.docx
@@ -230,15 +230,15 @@
           <w:sz w:val="24"/>
           <w:szCs w:val="24"/>
         </w:rPr>
-        <w:t xml:space="preserve">“Umalis ka dito at barilin kita! Putang ina mo, hayop ka! Manloloko, magnanakaw! Alis kayo dito!”</w:t>
-      </w:r>
-      <w:r>
-        <w:rPr>
-          <w:rFonts w:ascii="Times New Roman" w:cs="Times New Roman" w:eastAsia="Times New Roman" w:hAnsi="Times New Roman"/>
-          <w:sz w:val="24"/>
-          <w:szCs w:val="24"/>
-        </w:rPr>
-        <w:t xml:space="preserve"> (in English: “Leave this place or I will shoot you! You son of a whore, you animal! Swindler, thief! All of you, get out of here!”).</w:t>
+        <w:t xml:space="preserve">“Umalis ka dito! Putang ina mo, hayop ka! Manloloko, magnanakaw! Alis kayo dito!”</w:t>
+      </w:r>
+      <w:r>
+        <w:rPr>
+          <w:rFonts w:ascii="Times New Roman" w:cs="Times New Roman" w:eastAsia="Times New Roman" w:hAnsi="Times New Roman"/>
+          <w:sz w:val="24"/>
+          <w:szCs w:val="24"/>
+        </w:rPr>
+        <w:t xml:space="preserve"> (in English: “Leave this place! You son of a whore, you animal! Swindler, thief! All of you, get out of here!”).</w:t>
       </w:r>
     </w:p>
     <w:p>
@@ -293,15 +293,15 @@
           <w:sz w:val="24"/>
           <w:szCs w:val="24"/>
         </w:rPr>
-        <w:t xml:space="preserve">“Anong gusto mo? Patitirahin kita!”</w:t>
-      </w:r>
-      <w:r>
-        <w:rPr>
-          <w:rFonts w:ascii="Times New Roman" w:cs="Times New Roman" w:eastAsia="Times New Roman" w:hAnsi="Times New Roman"/>
-          <w:sz w:val="24"/>
-          <w:szCs w:val="24"/>
-        </w:rPr>
-        <w:t xml:space="preserve"> (in English: “What do you want? I will strike you!”).</w:t>
+        <w:t xml:space="preserve">“Anong gusto mo?”</w:t>
+      </w:r>
+      <w:r>
+        <w:rPr>
+          <w:rFonts w:ascii="Times New Roman" w:cs="Times New Roman" w:eastAsia="Times New Roman" w:hAnsi="Times New Roman"/>
+          <w:sz w:val="24"/>
+          <w:szCs w:val="24"/>
+        </w:rPr>
+        <w:t xml:space="preserve"> (in English: “What do you want?”).</w:t>
       </w:r>
     </w:p>
     <w:p>

</xml_diff>